<commit_message>
Added thesis plots, restructured tables
</commit_message>
<xml_diff>
--- a/03_report/tables/regression_results_team_process_h1_h5.docx
+++ b/03_report/tables/regression_results_team_process_h1_h5.docx
@@ -1304,7 +1304,7 @@
                 <w:szCs w:val="18"/>
                 <w:color w:val="000000"/>
               </w:rPr>
-              <w:t xml:space="preserve">0.131***</w:t>
+              <w:t xml:space="preserve">0.167***</w:t>
             </w:r>
             <w:r>
               <w:rPr>
@@ -1330,7 +1330,7 @@
                 <w:szCs w:val="18"/>
                 <w:color w:val="000000"/>
               </w:rPr>
-              <w:t xml:space="preserve">(0.009)</w:t>
+              <w:t xml:space="preserve">(0.006)</w:t>
             </w:r>
           </w:p>
         </w:tc>
@@ -1385,7 +1385,7 @@
                 <w:szCs w:val="18"/>
                 <w:color w:val="000000"/>
               </w:rPr>
-              <w:t xml:space="preserve">0.550***</w:t>
+              <w:t xml:space="preserve">0.478***</w:t>
             </w:r>
             <w:r>
               <w:rPr>
@@ -1411,7 +1411,7 @@
                 <w:szCs w:val="18"/>
                 <w:color w:val="000000"/>
               </w:rPr>
-              <w:t xml:space="preserve">(0.020)</w:t>
+              <w:t xml:space="preserve">(0.014)</w:t>
             </w:r>
           </w:p>
         </w:tc>
@@ -1466,7 +1466,7 @@
                 <w:szCs w:val="18"/>
                 <w:color w:val="000000"/>
               </w:rPr>
-              <w:t xml:space="preserve">0.233***</w:t>
+              <w:t xml:space="preserve">0.220***</w:t>
             </w:r>
             <w:r>
               <w:rPr>
@@ -1492,7 +1492,7 @@
                 <w:szCs w:val="18"/>
                 <w:color w:val="000000"/>
               </w:rPr>
-              <w:t xml:space="preserve">(0.010)</w:t>
+              <w:t xml:space="preserve">(0.006)</w:t>
             </w:r>
           </w:p>
         </w:tc>
@@ -1547,7 +1547,7 @@
                 <w:szCs w:val="18"/>
                 <w:color w:val="000000"/>
               </w:rPr>
-              <w:t xml:space="preserve">0.451***</w:t>
+              <w:t xml:space="preserve">0.462***</w:t>
             </w:r>
             <w:r>
               <w:rPr>
@@ -1573,7 +1573,7 @@
                 <w:szCs w:val="18"/>
                 <w:color w:val="000000"/>
               </w:rPr>
-              <w:t xml:space="preserve">(0.022)</w:t>
+              <w:t xml:space="preserve">(0.015)</w:t>
             </w:r>
           </w:p>
         </w:tc>
@@ -1628,7 +1628,7 @@
                 <w:szCs w:val="18"/>
                 <w:color w:val="000000"/>
               </w:rPr>
-              <w:t xml:space="preserve">0.450***</w:t>
+              <w:t xml:space="preserve">0.438***</w:t>
             </w:r>
             <w:r>
               <w:rPr>
@@ -1654,7 +1654,7 @@
                 <w:szCs w:val="18"/>
                 <w:color w:val="000000"/>
               </w:rPr>
-              <w:t xml:space="preserve">(0.037)</w:t>
+              <w:t xml:space="preserve">(0.024)</w:t>
             </w:r>
           </w:p>
         </w:tc>
@@ -1709,7 +1709,7 @@
                 <w:szCs w:val="18"/>
                 <w:color w:val="000000"/>
               </w:rPr>
-              <w:t xml:space="preserve">-0.665</w:t>
+              <w:t xml:space="preserve">-0.831*</w:t>
             </w:r>
             <w:r>
               <w:rPr>
@@ -1735,7 +1735,7 @@
                 <w:szCs w:val="18"/>
                 <w:color w:val="000000"/>
               </w:rPr>
-              <w:t xml:space="preserve">(0.462)</w:t>
+              <w:t xml:space="preserve">(0.325)</w:t>
             </w:r>
           </w:p>
         </w:tc>
@@ -1796,7 +1796,7 @@
                 <w:szCs w:val="18"/>
                 <w:color w:val="000000"/>
               </w:rPr>
-              <w:t xml:space="preserve">SMM treatment</w:t>
+              <w:t xml:space="preserve">Baseline</w:t>
             </w:r>
           </w:p>
         </w:tc>
@@ -1851,33 +1851,7 @@
                 <w:szCs w:val="18"/>
                 <w:color w:val="000000"/>
               </w:rPr>
-              <w:t xml:space="preserve">0.098***</w:t>
-            </w:r>
-            <w:r>
-              <w:rPr>
-                <w:rFonts w:ascii="Times New Roman" w:hAnsi="Times New Roman" w:eastAsia="Times New Roman" w:cs="Times New Roman"/>
-                <w:i w:val="false"/>
-                <w:b w:val="false"/>
-                <w:u w:val="none"/>
-                <w:strike w:val="false"/>
-                <w:sz w:val="18"/>
-                <w:szCs w:val="18"/>
-                <w:color w:val="000000"/>
-              </w:rPr>
-              <w:br/>
-            </w:r>
-            <w:r>
-              <w:rPr>
-                <w:rFonts w:ascii="Times New Roman" w:hAnsi="Times New Roman" w:eastAsia="Times New Roman" w:cs="Times New Roman"/>
-                <w:i w:val="false"/>
-                <w:b w:val="false"/>
-                <w:u w:val="none"/>
-                <w:strike w:val="false"/>
-                <w:sz w:val="18"/>
-                <w:szCs w:val="18"/>
-                <w:color w:val="000000"/>
-              </w:rPr>
-              <w:t xml:space="preserve">(0.011)</w:t>
+              <w:t xml:space="preserve"/>
             </w:r>
           </w:p>
         </w:tc>
@@ -1932,33 +1906,7 @@
                 <w:szCs w:val="18"/>
                 <w:color w:val="000000"/>
               </w:rPr>
-              <w:t xml:space="preserve">-0.032</w:t>
-            </w:r>
-            <w:r>
-              <w:rPr>
-                <w:rFonts w:ascii="Times New Roman" w:hAnsi="Times New Roman" w:eastAsia="Times New Roman" w:cs="Times New Roman"/>
-                <w:i w:val="false"/>
-                <w:b w:val="false"/>
-                <w:u w:val="none"/>
-                <w:strike w:val="false"/>
-                <w:sz w:val="18"/>
-                <w:szCs w:val="18"/>
-                <w:color w:val="000000"/>
-              </w:rPr>
-              <w:br/>
-            </w:r>
-            <w:r>
-              <w:rPr>
-                <w:rFonts w:ascii="Times New Roman" w:hAnsi="Times New Roman" w:eastAsia="Times New Roman" w:cs="Times New Roman"/>
-                <w:i w:val="false"/>
-                <w:b w:val="false"/>
-                <w:u w:val="none"/>
-                <w:strike w:val="false"/>
-                <w:sz w:val="18"/>
-                <w:szCs w:val="18"/>
-                <w:color w:val="000000"/>
-              </w:rPr>
-              <w:t xml:space="preserve">(0.025)</w:t>
+              <w:t xml:space="preserve"/>
             </w:r>
           </w:p>
         </w:tc>
@@ -2123,7 +2071,33 @@
                 <w:szCs w:val="18"/>
                 <w:color w:val="000000"/>
               </w:rPr>
-              <w:t xml:space="preserve"/>
+              <w:t xml:space="preserve">-0.428***</w:t>
+            </w:r>
+            <w:r>
+              <w:rPr>
+                <w:rFonts w:ascii="Times New Roman" w:hAnsi="Times New Roman" w:eastAsia="Times New Roman" w:cs="Times New Roman"/>
+                <w:i w:val="false"/>
+                <w:b w:val="false"/>
+                <w:u w:val="none"/>
+                <w:strike w:val="false"/>
+                <w:sz w:val="18"/>
+                <w:szCs w:val="18"/>
+                <w:color w:val="000000"/>
+              </w:rPr>
+              <w:br/>
+            </w:r>
+            <w:r>
+              <w:rPr>
+                <w:rFonts w:ascii="Times New Roman" w:hAnsi="Times New Roman" w:eastAsia="Times New Roman" w:cs="Times New Roman"/>
+                <w:i w:val="false"/>
+                <w:b w:val="false"/>
+                <w:u w:val="none"/>
+                <w:strike w:val="false"/>
+                <w:sz w:val="18"/>
+                <w:szCs w:val="18"/>
+                <w:color w:val="000000"/>
+              </w:rPr>
+              <w:t xml:space="preserve">(0.015)</w:t>
             </w:r>
           </w:p>
         </w:tc>
@@ -2178,7 +2152,33 @@
                 <w:szCs w:val="18"/>
                 <w:color w:val="000000"/>
               </w:rPr>
-              <w:t xml:space="preserve"/>
+              <w:t xml:space="preserve">-0.747***</w:t>
+            </w:r>
+            <w:r>
+              <w:rPr>
+                <w:rFonts w:ascii="Times New Roman" w:hAnsi="Times New Roman" w:eastAsia="Times New Roman" w:cs="Times New Roman"/>
+                <w:i w:val="false"/>
+                <w:b w:val="false"/>
+                <w:u w:val="none"/>
+                <w:strike w:val="false"/>
+                <w:sz w:val="18"/>
+                <w:szCs w:val="18"/>
+                <w:color w:val="000000"/>
+              </w:rPr>
+              <w:br/>
+            </w:r>
+            <w:r>
+              <w:rPr>
+                <w:rFonts w:ascii="Times New Roman" w:hAnsi="Times New Roman" w:eastAsia="Times New Roman" w:cs="Times New Roman"/>
+                <w:i w:val="false"/>
+                <w:b w:val="false"/>
+                <w:u w:val="none"/>
+                <w:strike w:val="false"/>
+                <w:sz w:val="18"/>
+                <w:szCs w:val="18"/>
+                <w:color w:val="000000"/>
+              </w:rPr>
+              <w:t xml:space="preserve">(0.222)</w:t>
             </w:r>
           </w:p>
         </w:tc>
@@ -2294,7 +2294,33 @@
                 <w:szCs w:val="18"/>
                 <w:color w:val="000000"/>
               </w:rPr>
-              <w:t xml:space="preserve"/>
+              <w:t xml:space="preserve">0.072***</w:t>
+            </w:r>
+            <w:r>
+              <w:rPr>
+                <w:rFonts w:ascii="Times New Roman" w:hAnsi="Times New Roman" w:eastAsia="Times New Roman" w:cs="Times New Roman"/>
+                <w:i w:val="false"/>
+                <w:b w:val="false"/>
+                <w:u w:val="none"/>
+                <w:strike w:val="false"/>
+                <w:sz w:val="18"/>
+                <w:szCs w:val="18"/>
+                <w:color w:val="000000"/>
+              </w:rPr>
+              <w:br/>
+            </w:r>
+            <w:r>
+              <w:rPr>
+                <w:rFonts w:ascii="Times New Roman" w:hAnsi="Times New Roman" w:eastAsia="Times New Roman" w:cs="Times New Roman"/>
+                <w:i w:val="false"/>
+                <w:b w:val="false"/>
+                <w:u w:val="none"/>
+                <w:strike w:val="false"/>
+                <w:sz w:val="18"/>
+                <w:szCs w:val="18"/>
+                <w:color w:val="000000"/>
+              </w:rPr>
+              <w:t xml:space="preserve">(0.010)</w:t>
             </w:r>
           </w:p>
         </w:tc>
@@ -2349,7 +2375,33 @@
                 <w:szCs w:val="18"/>
                 <w:color w:val="000000"/>
               </w:rPr>
-              <w:t xml:space="preserve"/>
+              <w:t xml:space="preserve">0.139***</w:t>
+            </w:r>
+            <w:r>
+              <w:rPr>
+                <w:rFonts w:ascii="Times New Roman" w:hAnsi="Times New Roman" w:eastAsia="Times New Roman" w:cs="Times New Roman"/>
+                <w:i w:val="false"/>
+                <w:b w:val="false"/>
+                <w:u w:val="none"/>
+                <w:strike w:val="false"/>
+                <w:sz w:val="18"/>
+                <w:szCs w:val="18"/>
+                <w:color w:val="000000"/>
+              </w:rPr>
+              <w:br/>
+            </w:r>
+            <w:r>
+              <w:rPr>
+                <w:rFonts w:ascii="Times New Roman" w:hAnsi="Times New Roman" w:eastAsia="Times New Roman" w:cs="Times New Roman"/>
+                <w:i w:val="false"/>
+                <w:b w:val="false"/>
+                <w:u w:val="none"/>
+                <w:strike w:val="false"/>
+                <w:sz w:val="18"/>
+                <w:szCs w:val="18"/>
+                <w:color w:val="000000"/>
+              </w:rPr>
+              <w:t xml:space="preserve">(0.020)</w:t>
             </w:r>
           </w:p>
         </w:tc>
@@ -2404,7 +2456,7 @@
                 <w:szCs w:val="18"/>
                 <w:color w:val="000000"/>
               </w:rPr>
-              <w:t xml:space="preserve">0.030*</w:t>
+              <w:t xml:space="preserve">0.019*</w:t>
             </w:r>
             <w:r>
               <w:rPr>
@@ -2430,7 +2482,7 @@
                 <w:szCs w:val="18"/>
                 <w:color w:val="000000"/>
               </w:rPr>
-              <w:t xml:space="preserve">(0.015)</w:t>
+              <w:t xml:space="preserve">(0.010)</w:t>
             </w:r>
           </w:p>
         </w:tc>
@@ -2485,7 +2537,7 @@
                 <w:szCs w:val="18"/>
                 <w:color w:val="000000"/>
               </w:rPr>
-              <w:t xml:space="preserve">0.207***</w:t>
+              <w:t xml:space="preserve">0.155***</w:t>
             </w:r>
             <w:r>
               <w:rPr>
@@ -2511,7 +2563,7 @@
                 <w:szCs w:val="18"/>
                 <w:color w:val="000000"/>
               </w:rPr>
-              <w:t xml:space="preserve">(0.028)</w:t>
+              <w:t xml:space="preserve">(0.021)</w:t>
             </w:r>
           </w:p>
         </w:tc>
@@ -2566,7 +2618,7 @@
                 <w:szCs w:val="18"/>
                 <w:color w:val="000000"/>
               </w:rPr>
-              <w:t xml:space="preserve">0.035</w:t>
+              <w:t xml:space="preserve">0.008</w:t>
             </w:r>
             <w:r>
               <w:rPr>
@@ -2592,7 +2644,7 @@
                 <w:szCs w:val="18"/>
                 <w:color w:val="000000"/>
               </w:rPr>
-              <w:t xml:space="preserve">(0.032)</w:t>
+              <w:t xml:space="preserve">(0.020)</w:t>
             </w:r>
           </w:p>
         </w:tc>
@@ -2647,7 +2699,7 @@
                 <w:szCs w:val="18"/>
                 <w:color w:val="000000"/>
               </w:rPr>
-              <w:t xml:space="preserve">0.038</w:t>
+              <w:t xml:space="preserve">0.064</w:t>
             </w:r>
             <w:r>
               <w:rPr>
@@ -2673,7 +2725,7 @@
                 <w:szCs w:val="18"/>
                 <w:color w:val="000000"/>
               </w:rPr>
-              <w:t xml:space="preserve">(0.375)</w:t>
+              <w:t xml:space="preserve">(0.238)</w:t>
             </w:r>
           </w:p>
         </w:tc>
@@ -2734,7 +2786,7 @@
                 <w:szCs w:val="18"/>
                 <w:color w:val="000000"/>
               </w:rPr>
-              <w:t xml:space="preserve">High transparency</w:t>
+              <w:t xml:space="preserve">Moderate transparency</w:t>
             </w:r>
           </w:p>
         </w:tc>
@@ -2789,7 +2841,33 @@
                 <w:szCs w:val="18"/>
                 <w:color w:val="000000"/>
               </w:rPr>
-              <w:t xml:space="preserve"/>
+              <w:t xml:space="preserve">0.053***</w:t>
+            </w:r>
+            <w:r>
+              <w:rPr>
+                <w:rFonts w:ascii="Times New Roman" w:hAnsi="Times New Roman" w:eastAsia="Times New Roman" w:cs="Times New Roman"/>
+                <w:i w:val="false"/>
+                <w:b w:val="false"/>
+                <w:u w:val="none"/>
+                <w:strike w:val="false"/>
+                <w:sz w:val="18"/>
+                <w:szCs w:val="18"/>
+                <w:color w:val="000000"/>
+              </w:rPr>
+              <w:br/>
+            </w:r>
+            <w:r>
+              <w:rPr>
+                <w:rFonts w:ascii="Times New Roman" w:hAnsi="Times New Roman" w:eastAsia="Times New Roman" w:cs="Times New Roman"/>
+                <w:i w:val="false"/>
+                <w:b w:val="false"/>
+                <w:u w:val="none"/>
+                <w:strike w:val="false"/>
+                <w:sz w:val="18"/>
+                <w:szCs w:val="18"/>
+                <w:color w:val="000000"/>
+              </w:rPr>
+              <w:t xml:space="preserve">(0.009)</w:t>
             </w:r>
           </w:p>
         </w:tc>
@@ -2844,7 +2922,33 @@
                 <w:szCs w:val="18"/>
                 <w:color w:val="000000"/>
               </w:rPr>
-              <w:t xml:space="preserve"/>
+              <w:t xml:space="preserve">-0.016</w:t>
+            </w:r>
+            <w:r>
+              <w:rPr>
+                <w:rFonts w:ascii="Times New Roman" w:hAnsi="Times New Roman" w:eastAsia="Times New Roman" w:cs="Times New Roman"/>
+                <w:i w:val="false"/>
+                <w:b w:val="false"/>
+                <w:u w:val="none"/>
+                <w:strike w:val="false"/>
+                <w:sz w:val="18"/>
+                <w:szCs w:val="18"/>
+                <w:color w:val="000000"/>
+              </w:rPr>
+              <w:br/>
+            </w:r>
+            <w:r>
+              <w:rPr>
+                <w:rFonts w:ascii="Times New Roman" w:hAnsi="Times New Roman" w:eastAsia="Times New Roman" w:cs="Times New Roman"/>
+                <w:i w:val="false"/>
+                <w:b w:val="false"/>
+                <w:u w:val="none"/>
+                <w:strike w:val="false"/>
+                <w:sz w:val="18"/>
+                <w:szCs w:val="18"/>
+                <w:color w:val="000000"/>
+              </w:rPr>
+              <w:t xml:space="preserve">(0.021)</w:t>
             </w:r>
           </w:p>
         </w:tc>
@@ -2899,33 +3003,7 @@
                 <w:szCs w:val="18"/>
                 <w:color w:val="000000"/>
               </w:rPr>
-              <w:t xml:space="preserve">-0.043**</w:t>
-            </w:r>
-            <w:r>
-              <w:rPr>
-                <w:rFonts w:ascii="Times New Roman" w:hAnsi="Times New Roman" w:eastAsia="Times New Roman" w:cs="Times New Roman"/>
-                <w:i w:val="false"/>
-                <w:b w:val="false"/>
-                <w:u w:val="none"/>
-                <w:strike w:val="false"/>
-                <w:sz w:val="18"/>
-                <w:szCs w:val="18"/>
-                <w:color w:val="000000"/>
-              </w:rPr>
-              <w:br/>
-            </w:r>
-            <w:r>
-              <w:rPr>
-                <w:rFonts w:ascii="Times New Roman" w:hAnsi="Times New Roman" w:eastAsia="Times New Roman" w:cs="Times New Roman"/>
-                <w:i w:val="false"/>
-                <w:b w:val="false"/>
-                <w:u w:val="none"/>
-                <w:strike w:val="false"/>
-                <w:sz w:val="18"/>
-                <w:szCs w:val="18"/>
-                <w:color w:val="000000"/>
-              </w:rPr>
-              <w:t xml:space="preserve">(0.013)</w:t>
+              <w:t xml:space="preserve"/>
             </w:r>
           </w:p>
         </w:tc>
@@ -2980,33 +3058,7 @@
                 <w:szCs w:val="18"/>
                 <w:color w:val="000000"/>
               </w:rPr>
-              <w:t xml:space="preserve">-0.007</w:t>
-            </w:r>
-            <w:r>
-              <w:rPr>
-                <w:rFonts w:ascii="Times New Roman" w:hAnsi="Times New Roman" w:eastAsia="Times New Roman" w:cs="Times New Roman"/>
-                <w:i w:val="false"/>
-                <w:b w:val="false"/>
-                <w:u w:val="none"/>
-                <w:strike w:val="false"/>
-                <w:sz w:val="18"/>
-                <w:szCs w:val="18"/>
-                <w:color w:val="000000"/>
-              </w:rPr>
-              <w:br/>
-            </w:r>
-            <w:r>
-              <w:rPr>
-                <w:rFonts w:ascii="Times New Roman" w:hAnsi="Times New Roman" w:eastAsia="Times New Roman" w:cs="Times New Roman"/>
-                <w:i w:val="false"/>
-                <w:b w:val="false"/>
-                <w:u w:val="none"/>
-                <w:strike w:val="false"/>
-                <w:sz w:val="18"/>
-                <w:szCs w:val="18"/>
-                <w:color w:val="000000"/>
-              </w:rPr>
-              <w:t xml:space="preserve">(0.034)</w:t>
+              <w:t xml:space="preserve"/>
             </w:r>
           </w:p>
         </w:tc>
@@ -3061,33 +3113,7 @@
                 <w:szCs w:val="18"/>
                 <w:color w:val="000000"/>
               </w:rPr>
-              <w:t xml:space="preserve">-0.004</w:t>
-            </w:r>
-            <w:r>
-              <w:rPr>
-                <w:rFonts w:ascii="Times New Roman" w:hAnsi="Times New Roman" w:eastAsia="Times New Roman" w:cs="Times New Roman"/>
-                <w:i w:val="false"/>
-                <w:b w:val="false"/>
-                <w:u w:val="none"/>
-                <w:strike w:val="false"/>
-                <w:sz w:val="18"/>
-                <w:szCs w:val="18"/>
-                <w:color w:val="000000"/>
-              </w:rPr>
-              <w:br/>
-            </w:r>
-            <w:r>
-              <w:rPr>
-                <w:rFonts w:ascii="Times New Roman" w:hAnsi="Times New Roman" w:eastAsia="Times New Roman" w:cs="Times New Roman"/>
-                <w:i w:val="false"/>
-                <w:b w:val="false"/>
-                <w:u w:val="none"/>
-                <w:strike w:val="false"/>
-                <w:sz w:val="18"/>
-                <w:szCs w:val="18"/>
-                <w:color w:val="000000"/>
-              </w:rPr>
-              <w:t xml:space="preserve">(0.025)</w:t>
+              <w:t xml:space="preserve"/>
             </w:r>
           </w:p>
         </w:tc>
@@ -3142,33 +3168,7 @@
                 <w:szCs w:val="18"/>
                 <w:color w:val="000000"/>
               </w:rPr>
-              <w:t xml:space="preserve">-0.701*</w:t>
-            </w:r>
-            <w:r>
-              <w:rPr>
-                <w:rFonts w:ascii="Times New Roman" w:hAnsi="Times New Roman" w:eastAsia="Times New Roman" w:cs="Times New Roman"/>
-                <w:i w:val="false"/>
-                <w:b w:val="false"/>
-                <w:u w:val="none"/>
-                <w:strike w:val="false"/>
-                <w:sz w:val="18"/>
-                <w:szCs w:val="18"/>
-                <w:color w:val="000000"/>
-              </w:rPr>
-              <w:br/>
-            </w:r>
-            <w:r>
-              <w:rPr>
-                <w:rFonts w:ascii="Times New Roman" w:hAnsi="Times New Roman" w:eastAsia="Times New Roman" w:cs="Times New Roman"/>
-                <w:i w:val="false"/>
-                <w:b w:val="false"/>
-                <w:u w:val="none"/>
-                <w:strike w:val="false"/>
-                <w:sz w:val="18"/>
-                <w:szCs w:val="18"/>
-                <w:color w:val="000000"/>
-              </w:rPr>
-              <w:t xml:space="preserve">(0.327)</w:t>
+              <w:t xml:space="preserve"/>
             </w:r>
           </w:p>
         </w:tc>
@@ -3229,7 +3229,7 @@
                 <w:szCs w:val="18"/>
                 <w:color w:val="000000"/>
               </w:rPr>
-              <w:t xml:space="preserve">Communication</w:t>
+              <w:t xml:space="preserve">High transparency</w:t>
             </w:r>
           </w:p>
         </w:tc>
@@ -3284,7 +3284,33 @@
                 <w:szCs w:val="18"/>
                 <w:color w:val="000000"/>
               </w:rPr>
-              <w:t xml:space="preserve"/>
+              <w:t xml:space="preserve">0.027**</w:t>
+            </w:r>
+            <w:r>
+              <w:rPr>
+                <w:rFonts w:ascii="Times New Roman" w:hAnsi="Times New Roman" w:eastAsia="Times New Roman" w:cs="Times New Roman"/>
+                <w:i w:val="false"/>
+                <w:b w:val="false"/>
+                <w:u w:val="none"/>
+                <w:strike w:val="false"/>
+                <w:sz w:val="18"/>
+                <w:szCs w:val="18"/>
+                <w:color w:val="000000"/>
+              </w:rPr>
+              <w:br/>
+            </w:r>
+            <w:r>
+              <w:rPr>
+                <w:rFonts w:ascii="Times New Roman" w:hAnsi="Times New Roman" w:eastAsia="Times New Roman" w:cs="Times New Roman"/>
+                <w:i w:val="false"/>
+                <w:b w:val="false"/>
+                <w:u w:val="none"/>
+                <w:strike w:val="false"/>
+                <w:sz w:val="18"/>
+                <w:szCs w:val="18"/>
+                <w:color w:val="000000"/>
+              </w:rPr>
+              <w:t xml:space="preserve">(0.009)</w:t>
             </w:r>
           </w:p>
         </w:tc>
@@ -3339,7 +3365,33 @@
                 <w:szCs w:val="18"/>
                 <w:color w:val="000000"/>
               </w:rPr>
-              <w:t xml:space="preserve"/>
+              <w:t xml:space="preserve">-0.046*</w:t>
+            </w:r>
+            <w:r>
+              <w:rPr>
+                <w:rFonts w:ascii="Times New Roman" w:hAnsi="Times New Roman" w:eastAsia="Times New Roman" w:cs="Times New Roman"/>
+                <w:i w:val="false"/>
+                <w:b w:val="false"/>
+                <w:u w:val="none"/>
+                <w:strike w:val="false"/>
+                <w:sz w:val="18"/>
+                <w:szCs w:val="18"/>
+                <w:color w:val="000000"/>
+              </w:rPr>
+              <w:br/>
+            </w:r>
+            <w:r>
+              <w:rPr>
+                <w:rFonts w:ascii="Times New Roman" w:hAnsi="Times New Roman" w:eastAsia="Times New Roman" w:cs="Times New Roman"/>
+                <w:i w:val="false"/>
+                <w:b w:val="false"/>
+                <w:u w:val="none"/>
+                <w:strike w:val="false"/>
+                <w:sz w:val="18"/>
+                <w:szCs w:val="18"/>
+                <w:color w:val="000000"/>
+              </w:rPr>
+              <w:t xml:space="preserve">(0.023)</w:t>
             </w:r>
           </w:p>
         </w:tc>
@@ -3394,7 +3446,33 @@
                 <w:szCs w:val="18"/>
                 <w:color w:val="000000"/>
               </w:rPr>
-              <w:t xml:space="preserve"/>
+              <w:t xml:space="preserve">-0.026**</w:t>
+            </w:r>
+            <w:r>
+              <w:rPr>
+                <w:rFonts w:ascii="Times New Roman" w:hAnsi="Times New Roman" w:eastAsia="Times New Roman" w:cs="Times New Roman"/>
+                <w:i w:val="false"/>
+                <w:b w:val="false"/>
+                <w:u w:val="none"/>
+                <w:strike w:val="false"/>
+                <w:sz w:val="18"/>
+                <w:szCs w:val="18"/>
+                <w:color w:val="000000"/>
+              </w:rPr>
+              <w:br/>
+            </w:r>
+            <w:r>
+              <w:rPr>
+                <w:rFonts w:ascii="Times New Roman" w:hAnsi="Times New Roman" w:eastAsia="Times New Roman" w:cs="Times New Roman"/>
+                <w:i w:val="false"/>
+                <w:b w:val="false"/>
+                <w:u w:val="none"/>
+                <w:strike w:val="false"/>
+                <w:sz w:val="18"/>
+                <w:szCs w:val="18"/>
+                <w:color w:val="000000"/>
+              </w:rPr>
+              <w:t xml:space="preserve">(0.009)</w:t>
             </w:r>
           </w:p>
         </w:tc>
@@ -3449,7 +3527,33 @@
                 <w:szCs w:val="18"/>
                 <w:color w:val="000000"/>
               </w:rPr>
-              <w:t xml:space="preserve"/>
+              <w:t xml:space="preserve">-0.030</w:t>
+            </w:r>
+            <w:r>
+              <w:rPr>
+                <w:rFonts w:ascii="Times New Roman" w:hAnsi="Times New Roman" w:eastAsia="Times New Roman" w:cs="Times New Roman"/>
+                <w:i w:val="false"/>
+                <w:b w:val="false"/>
+                <w:u w:val="none"/>
+                <w:strike w:val="false"/>
+                <w:sz w:val="18"/>
+                <w:szCs w:val="18"/>
+                <w:color w:val="000000"/>
+              </w:rPr>
+              <w:br/>
+            </w:r>
+            <w:r>
+              <w:rPr>
+                <w:rFonts w:ascii="Times New Roman" w:hAnsi="Times New Roman" w:eastAsia="Times New Roman" w:cs="Times New Roman"/>
+                <w:i w:val="false"/>
+                <w:b w:val="false"/>
+                <w:u w:val="none"/>
+                <w:strike w:val="false"/>
+                <w:sz w:val="18"/>
+                <w:szCs w:val="18"/>
+                <w:color w:val="000000"/>
+              </w:rPr>
+              <w:t xml:space="preserve">(0.024)</w:t>
             </w:r>
           </w:p>
         </w:tc>
@@ -3504,7 +3608,7 @@
                 <w:szCs w:val="18"/>
                 <w:color w:val="000000"/>
               </w:rPr>
-              <w:t xml:space="preserve">0.548***</w:t>
+              <w:t xml:space="preserve">0.076***</w:t>
             </w:r>
             <w:r>
               <w:rPr>
@@ -3530,7 +3634,7 @@
                 <w:szCs w:val="18"/>
                 <w:color w:val="000000"/>
               </w:rPr>
-              <w:t xml:space="preserve">(0.102)</w:t>
+              <w:t xml:space="preserve">(0.022)</w:t>
             </w:r>
           </w:p>
         </w:tc>
@@ -3585,7 +3689,7 @@
                 <w:szCs w:val="18"/>
                 <w:color w:val="000000"/>
               </w:rPr>
-              <w:t xml:space="preserve">8.358***</w:t>
+              <w:t xml:space="preserve">-0.539*</w:t>
             </w:r>
             <w:r>
               <w:rPr>
@@ -3611,7 +3715,7 @@
                 <w:szCs w:val="18"/>
                 <w:color w:val="000000"/>
               </w:rPr>
-              <w:t xml:space="preserve">(1.320)</w:t>
+              <w:t xml:space="preserve">(0.220)</w:t>
             </w:r>
           </w:p>
         </w:tc>
@@ -3672,7 +3776,7 @@
                 <w:szCs w:val="18"/>
                 <w:color w:val="000000"/>
               </w:rPr>
-              <w:t xml:space="preserve">Cooperation</w:t>
+              <w:t xml:space="preserve">Communication</w:t>
             </w:r>
           </w:p>
         </w:tc>
@@ -3947,7 +4051,7 @@
                 <w:szCs w:val="18"/>
                 <w:color w:val="000000"/>
               </w:rPr>
-              <w:t xml:space="preserve">-0.061+</w:t>
+              <w:t xml:space="preserve">0.631***</w:t>
             </w:r>
             <w:r>
               <w:rPr>
@@ -3973,7 +4077,7 @@
                 <w:szCs w:val="18"/>
                 <w:color w:val="000000"/>
               </w:rPr>
-              <w:t xml:space="preserve">(0.034)</w:t>
+              <w:t xml:space="preserve">(0.066)</w:t>
             </w:r>
           </w:p>
         </w:tc>
@@ -4028,7 +4132,7 @@
                 <w:szCs w:val="18"/>
                 <w:color w:val="000000"/>
               </w:rPr>
-              <w:t xml:space="preserve">-0.201</w:t>
+              <w:t xml:space="preserve">6.503***</w:t>
             </w:r>
             <w:r>
               <w:rPr>
@@ -4054,7 +4158,7 @@
                 <w:szCs w:val="18"/>
                 <w:color w:val="000000"/>
               </w:rPr>
-              <w:t xml:space="preserve">(0.530)</w:t>
+              <w:t xml:space="preserve">(1.017)</w:t>
             </w:r>
           </w:p>
         </w:tc>
@@ -4115,7 +4219,7 @@
                 <w:szCs w:val="18"/>
                 <w:color w:val="000000"/>
               </w:rPr>
-              <w:t xml:space="preserve">Baseline</w:t>
+              <w:t xml:space="preserve">Cooperation</w:t>
             </w:r>
           </w:p>
         </w:tc>
@@ -4390,7 +4494,7 @@
                 <w:szCs w:val="18"/>
                 <w:color w:val="000000"/>
               </w:rPr>
-              <w:t xml:space="preserve">-0.420***</w:t>
+              <w:t xml:space="preserve">-0.081**</w:t>
             </w:r>
             <w:r>
               <w:rPr>
@@ -4416,7 +4520,7 @@
                 <w:szCs w:val="18"/>
                 <w:color w:val="000000"/>
               </w:rPr>
-              <w:t xml:space="preserve">(0.020)</w:t>
+              <w:t xml:space="preserve">(0.027)</w:t>
             </w:r>
           </w:p>
         </w:tc>
@@ -4471,7 +4575,7 @@
                 <w:szCs w:val="18"/>
                 <w:color w:val="000000"/>
               </w:rPr>
-              <w:t xml:space="preserve">-0.399</w:t>
+              <w:t xml:space="preserve">0.720+</w:t>
             </w:r>
             <w:r>
               <w:rPr>
@@ -4497,7 +4601,7 @@
                 <w:szCs w:val="18"/>
                 <w:color w:val="000000"/>
               </w:rPr>
-              <w:t xml:space="preserve">(0.333)</w:t>
+              <w:t xml:space="preserve">(0.368)</w:t>
             </w:r>
           </w:p>
         </w:tc>
@@ -4613,7 +4717,7 @@
                 <w:szCs w:val="18"/>
                 <w:color w:val="000000"/>
               </w:rPr>
-              <w:t xml:space="preserve">400</w:t>
+              <w:t xml:space="preserve">800</w:t>
             </w:r>
           </w:p>
         </w:tc>
@@ -4668,7 +4772,7 @@
                 <w:szCs w:val="18"/>
                 <w:color w:val="000000"/>
               </w:rPr>
-              <w:t xml:space="preserve">400</w:t>
+              <w:t xml:space="preserve">800</w:t>
             </w:r>
           </w:p>
         </w:tc>
@@ -4723,7 +4827,7 @@
                 <w:szCs w:val="18"/>
                 <w:color w:val="000000"/>
               </w:rPr>
-              <w:t xml:space="preserve">300</w:t>
+              <w:t xml:space="preserve">600</w:t>
             </w:r>
           </w:p>
         </w:tc>
@@ -4778,7 +4882,7 @@
                 <w:szCs w:val="18"/>
                 <w:color w:val="000000"/>
               </w:rPr>
-              <w:t xml:space="preserve">300</w:t>
+              <w:t xml:space="preserve">600</w:t>
             </w:r>
           </w:p>
         </w:tc>
@@ -4833,7 +4937,7 @@
                 <w:szCs w:val="18"/>
                 <w:color w:val="000000"/>
               </w:rPr>
-              <w:t xml:space="preserve">400</w:t>
+              <w:t xml:space="preserve">800</w:t>
             </w:r>
           </w:p>
         </w:tc>
@@ -4888,7 +4992,7 @@
                 <w:szCs w:val="18"/>
                 <w:color w:val="000000"/>
               </w:rPr>
-              <w:t xml:space="preserve">400</w:t>
+              <w:t xml:space="preserve">800</w:t>
             </w:r>
           </w:p>
         </w:tc>
@@ -5004,7 +5108,7 @@
                 <w:szCs w:val="18"/>
                 <w:color w:val="000000"/>
               </w:rPr>
-              <w:t xml:space="preserve">0.147</w:t>
+              <w:t xml:space="preserve">0.082</w:t>
             </w:r>
           </w:p>
         </w:tc>
@@ -5059,7 +5163,7 @@
                 <w:szCs w:val="18"/>
                 <w:color w:val="000000"/>
               </w:rPr>
-              <w:t xml:space="preserve">0.004</w:t>
+              <w:t xml:space="preserve">0.096</w:t>
             </w:r>
           </w:p>
         </w:tc>
@@ -5114,7 +5218,7 @@
                 <w:szCs w:val="18"/>
                 <w:color w:val="000000"/>
               </w:rPr>
-              <w:t xml:space="preserve">0.079</w:t>
+              <w:t xml:space="preserve">0.040</w:t>
             </w:r>
           </w:p>
         </w:tc>
@@ -5169,7 +5273,7 @@
                 <w:szCs w:val="18"/>
                 <w:color w:val="000000"/>
               </w:rPr>
-              <w:t xml:space="preserve">0.169</w:t>
+              <w:t xml:space="preserve">0.115</w:t>
             </w:r>
           </w:p>
         </w:tc>
@@ -5224,7 +5328,7 @@
                 <w:szCs w:val="18"/>
                 <w:color w:val="000000"/>
               </w:rPr>
-              <w:t xml:space="preserve">0.623</w:t>
+              <w:t xml:space="preserve">0.603</w:t>
             </w:r>
           </w:p>
         </w:tc>
@@ -5395,7 +5499,7 @@
                 <w:szCs w:val="18"/>
                 <w:color w:val="000000"/>
               </w:rPr>
-              <w:t xml:space="preserve">0.145</w:t>
+              <w:t xml:space="preserve">0.078</w:t>
             </w:r>
           </w:p>
         </w:tc>
@@ -5450,7 +5554,7 @@
                 <w:szCs w:val="18"/>
                 <w:color w:val="000000"/>
               </w:rPr>
-              <w:t xml:space="preserve">0.001</w:t>
+              <w:t xml:space="preserve">0.092</w:t>
             </w:r>
           </w:p>
         </w:tc>
@@ -5505,7 +5609,7 @@
                 <w:szCs w:val="18"/>
                 <w:color w:val="000000"/>
               </w:rPr>
-              <w:t xml:space="preserve">0.073</w:t>
+              <w:t xml:space="preserve">0.036</w:t>
             </w:r>
           </w:p>
         </w:tc>
@@ -5560,7 +5664,7 @@
                 <w:szCs w:val="18"/>
                 <w:color w:val="000000"/>
               </w:rPr>
-              <w:t xml:space="preserve">0.163</w:t>
+              <w:t xml:space="preserve">0.112</w:t>
             </w:r>
           </w:p>
         </w:tc>
@@ -5615,7 +5719,7 @@
                 <w:szCs w:val="18"/>
                 <w:color w:val="000000"/>
               </w:rPr>
-              <w:t xml:space="preserve">0.618</w:t>
+              <w:t xml:space="preserve">0.601</w:t>
             </w:r>
           </w:p>
         </w:tc>
@@ -5732,7 +5836,7 @@
                 <w:szCs w:val="16"/>
                 <w:color w:val="000000"/>
               </w:rPr>
-              <w:t xml:space="preserve">Note: Standard errors in parentheses. + p &lt; .10, * p &lt; .05, ** p &lt; .01, *** p &lt; .001</w:t>
+              <w:t xml:space="preserve">Note: Heteroskedasticity-robust HC3 standard errors in parentheses. + p &lt; .10, * p &lt; .05, ** p &lt; .01, *** p &lt; .001</w:t>
             </w:r>
           </w:p>
         </w:tc>

</xml_diff>

<commit_message>
Updated readme and cleaned code base
</commit_message>
<xml_diff>
--- a/03_report/tables/regression_results_team_process_h1_h5.docx
+++ b/03_report/tables/regression_results_team_process_h1_h5.docx
@@ -737,7 +737,7 @@
                 <w:szCs w:val="18"/>
                 <w:color w:val="000000"/>
               </w:rPr>
-              <w:t xml:space="preserve">H4a/H5a</w:t>
+              <w:t xml:space="preserve">H4a/H4b</w:t>
             </w:r>
           </w:p>
         </w:tc>
@@ -792,7 +792,7 @@
                 <w:szCs w:val="18"/>
                 <w:color w:val="000000"/>
               </w:rPr>
-              <w:t xml:space="preserve">H4b/H5b</w:t>
+              <w:t xml:space="preserve">H5a/H5b</w:t>
             </w:r>
           </w:p>
         </w:tc>
@@ -5483,7 +5483,7 @@
                 <w:szCs w:val="18"/>
                 <w:color w:val="000000"/>
               </w:rPr>
-              <w:t xml:space="preserve">0.082</w:t>
+              <w:t xml:space="preserve">.082</w:t>
             </w:r>
           </w:p>
         </w:tc>
@@ -5538,7 +5538,7 @@
                 <w:szCs w:val="18"/>
                 <w:color w:val="000000"/>
               </w:rPr>
-              <w:t xml:space="preserve">0.096</w:t>
+              <w:t xml:space="preserve">.096</w:t>
             </w:r>
           </w:p>
         </w:tc>
@@ -5593,7 +5593,7 @@
                 <w:szCs w:val="18"/>
                 <w:color w:val="000000"/>
               </w:rPr>
-              <w:t xml:space="preserve">0.040</w:t>
+              <w:t xml:space="preserve">.040</w:t>
             </w:r>
           </w:p>
         </w:tc>
@@ -5648,7 +5648,7 @@
                 <w:szCs w:val="18"/>
                 <w:color w:val="000000"/>
               </w:rPr>
-              <w:t xml:space="preserve">0.115</w:t>
+              <w:t xml:space="preserve">.115</w:t>
             </w:r>
           </w:p>
         </w:tc>
@@ -5703,7 +5703,7 @@
                 <w:szCs w:val="18"/>
                 <w:color w:val="000000"/>
               </w:rPr>
-              <w:t xml:space="preserve">0.603</w:t>
+              <w:t xml:space="preserve">.603</w:t>
             </w:r>
           </w:p>
         </w:tc>
@@ -5758,7 +5758,7 @@
                 <w:szCs w:val="18"/>
                 <w:color w:val="000000"/>
               </w:rPr>
-              <w:t xml:space="preserve"/>
+              <w:t xml:space="preserve">-</w:t>
             </w:r>
           </w:p>
         </w:tc>
@@ -5873,7 +5873,7 @@
                 <w:szCs w:val="18"/>
                 <w:color w:val="000000"/>
               </w:rPr>
-              <w:t xml:space="preserve">0.078</w:t>
+              <w:t xml:space="preserve">.078</w:t>
             </w:r>
           </w:p>
         </w:tc>
@@ -5928,7 +5928,7 @@
                 <w:szCs w:val="18"/>
                 <w:color w:val="000000"/>
               </w:rPr>
-              <w:t xml:space="preserve">0.092</w:t>
+              <w:t xml:space="preserve">.092</w:t>
             </w:r>
           </w:p>
         </w:tc>
@@ -5983,7 +5983,7 @@
                 <w:szCs w:val="18"/>
                 <w:color w:val="000000"/>
               </w:rPr>
-              <w:t xml:space="preserve">0.036</w:t>
+              <w:t xml:space="preserve">.036</w:t>
             </w:r>
           </w:p>
         </w:tc>
@@ -6038,7 +6038,7 @@
                 <w:szCs w:val="18"/>
                 <w:color w:val="000000"/>
               </w:rPr>
-              <w:t xml:space="preserve">0.112</w:t>
+              <w:t xml:space="preserve">.112</w:t>
             </w:r>
           </w:p>
         </w:tc>
@@ -6093,7 +6093,7 @@
                 <w:szCs w:val="18"/>
                 <w:color w:val="000000"/>
               </w:rPr>
-              <w:t xml:space="preserve">0.601</w:t>
+              <w:t xml:space="preserve">.601</w:t>
             </w:r>
           </w:p>
         </w:tc>
@@ -6148,7 +6148,7 @@
                 <w:szCs w:val="18"/>
                 <w:color w:val="000000"/>
               </w:rPr>
-              <w:t xml:space="preserve"/>
+              <w:t xml:space="preserve">-</w:t>
             </w:r>
           </w:p>
         </w:tc>
@@ -6209,7 +6209,7 @@
                 <w:szCs w:val="16"/>
                 <w:color w:val="000000"/>
               </w:rPr>
-              <w:t xml:space="preserve">Note: HC3 standard errors in parentheses. + p &lt; .10, * p &lt; .05, ** p &lt; .01, *** p &lt; .001</w:t>
+              <w:t xml:space="preserve">Note: HC3 standard errors in parentheses. + p &lt; .10, * p &lt; .05, ** p &lt; .01, *** p &lt; .001.</w:t>
             </w:r>
           </w:p>
         </w:tc>

</xml_diff>